<commit_message>
Showcase, etapa 2: la lista de partidas en la red, el teclado en pantalla y los botones
La pantalla de conexión busca sola las partidas abiertas en la misma PC o en
la red (LanDiscovery, UDP 7771) y las muestra como botones: apretar una
conecta. La PC con la partida la anuncia sola. Con control, A sobre un campo
de texto abre el teclado en pantalla (UI_OnScreenKeyboard: X borra, Y espacio,
Start acepta, B cancela), para la dirección y el nombre en la sala.

Todos los botones de los menús llevan su color en el Button y la imagen
blanca (ButtonTint): el elegido se ve del mismo color, más oscuro, en vez
del tinte que dependía del color de la imagen.

Documentos al día: Red_Arquitectura.docx, el LEEME del modo y CLAUDE.md
(la conexión en los menús, cualquiera puede hostear, la lista y la pausa).

Co-Authored-By: Claude Opus 5.5 <noreply@anthropic.com>
</commit_message>
<xml_diff>
--- a/DesignDocuments/Red_Arquitectura.docx
+++ b/DesignDocuments/Red_Arquitectura.docx
@@ -45,7 +45,7 @@
           <w:sz w:val="20"/>
           <w:szCs w:val="20"/>
         </w:rPr>
-        <w:t xml:space="preserve">Estado del código al 13 de octubre de 2026 · FishNet 4.7.2 · Unity 6000.0.59f2</w:t>
+        <w:t xml:space="preserve">Estado del código al 26 de octubre de 2026 · FishNet 4.7.2 · Unity 6000.0.59f2</w:t>
       </w:r>
     </w:p>
     <w:p>
@@ -148,26 +148,31 @@
         <w:spacing w:after="80" w:line="276"/>
       </w:pPr>
       <w:r>
-        <w:rPr>
-          <w:b/>
-          <w:bCs/>
-        </w:rPr>
-        <w:t xml:space="preserve">Red:</w:t>
-      </w:r>
-      <w:r>
-        <w:t xml:space="preserve"> FishNet 4.7.2 con el transporte Tugboat (UDP, puerto 7770). Para jugar por internet se usa un túnel de playit.gg, sin abrir puertos. </w:t>
-      </w:r>
-      <w:r>
-        <w:rPr>
-          <w:rFonts w:ascii="Consolas" w:cs="Consolas" w:eastAsia="Consolas" w:hAnsi="Consolas"/>
-          <w:color w:val="1F4D78"/>
-          <w:sz w:val="19"/>
-          <w:szCs w:val="19"/>
-        </w:rPr>
-        <w:t xml:space="preserve">Assets/Scripts/Network/ConnectionHUD.cs</w:t>
-      </w:r>
-      <w:r>
-        <w:t xml:space="preserve"> arranca el host o el cliente.</w:t>
+        <w:t xml:space="preserve">Red: FishNet 4.7.2 con el transporte Tugboat (UDP, puerto 7770). Para jugar por internet se usa un túnel de playit.gg, sin abrir puertos. La pantalla de conexión de los menús (</w:t>
+      </w:r>
+      <w:r>
+        <w:rPr>
+          <w:rFonts w:ascii="Consolas" w:cs="Consolas" w:eastAsia="Consolas" w:hAnsi="Consolas"/>
+          <w:color w:val="1F4D78"/>
+          <w:sz w:val="19"/>
+          <w:szCs w:val="19"/>
+        </w:rPr>
+        <w:t xml:space="preserve">UI_ConnectPanel</w:t>
+      </w:r>
+      <w:r>
+        <w:t xml:space="preserve">) arranca el host o el cliente; en la misma PC o en la misma red, la lista de partidas (</w:t>
+      </w:r>
+      <w:r>
+        <w:rPr>
+          <w:rFonts w:ascii="Consolas" w:cs="Consolas" w:eastAsia="Consolas" w:hAnsi="Consolas"/>
+          <w:color w:val="1F4D78"/>
+          <w:sz w:val="19"/>
+          <w:szCs w:val="19"/>
+        </w:rPr>
+        <w:t xml:space="preserve">LanDiscovery</w:t>
+      </w:r>
+      <w:r>
+        <w:t xml:space="preserve">, UDP 7771) las encuentra sola.</w:t>
       </w:r>
     </w:p>
     <w:p>
@@ -180,24 +185,7 @@
         <w:spacing w:after="80" w:line="276"/>
       </w:pPr>
       <w:r>
-        <w:rPr>
-          <w:b/>
-          <w:bCs/>
-        </w:rPr>
-        <w:t xml:space="preserve">Topología:</w:t>
-      </w:r>
-      <w:r>
-        <w:t xml:space="preserve"> un </w:t>
-      </w:r>
-      <w:r>
-        <w:rPr>
-          <w:b/>
-          <w:bCs/>
-        </w:rPr>
-        <w:t xml:space="preserve">host</w:t>
-      </w:r>
-      <w:r>
-        <w:t xml:space="preserve"> (servidor + cliente en el mismo proceso) y el resto clientes. No hay servidor dedicado. El host es el editor de Unity, o una build abierta con el argumento </w:t>
+        <w:t xml:space="preserve">Topología: un host (servidor + cliente en el mismo proceso) y el resto clientes. No hay servidor dedicado. Cualquier build puede ser el host (Jugar → Crear partida), desde el 26 de octubre de 2026; antes solo el editor de Unity o una build abierta con </w:t>
       </w:r>
       <w:r>
         <w:rPr>
@@ -592,6 +580,238 @@
                 <w:sz w:val="19"/>
                 <w:szCs w:val="19"/>
               </w:rPr>
+              <w:t xml:space="preserve">Scripts/UI/UI_ConnectPanel.cs</w:t>
+            </w:r>
+          </w:p>
+        </w:tc>
+        <w:tc>
+          <w:tcPr>
+            <w:tcW w:type="dxa" w:w="7028"/>
+            <w:tcBorders>
+              <w:top w:val="single" w:color="BFBFBF" w:sz="4"/>
+              <w:left w:val="single" w:color="BFBFBF" w:sz="4"/>
+              <w:bottom w:val="single" w:color="BFBFBF" w:sz="4"/>
+              <w:right w:val="single" w:color="BFBFBF" w:sz="4"/>
+            </w:tcBorders>
+            <w:tcMar>
+              <w:top w:type="dxa" w:w="60"/>
+              <w:left w:type="dxa" w:w="100"/>
+              <w:bottom w:type="dxa" w:w="60"/>
+              <w:right w:type="dxa" w:w="100"/>
+            </w:tcMar>
+          </w:tcPr>
+          <w:p>
+            <w:pPr>
+              <w:spacing w:after="0" w:line="252"/>
+            </w:pPr>
+            <w:r>
+              <w:t xml:space="preserve">La pantalla de conexión (en el prefab de menús). Crear partida arranca el servidor y, recién cuando avisó que arrancó, el cliente local a 127.0.0.1; si el puerto ya está tomado, avisa y no conecta. Conectar va a la dirección escrita (IP o host:puerto, la de playit) o a una partida de la lista. Antes de cada intento corta cualquier intento anterior a medias.</w:t>
+            </w:r>
+          </w:p>
+        </w:tc>
+      </w:tr>
+      <w:tr>
+        <w:tc>
+          <w:tcPr>
+            <w:tcW w:type="dxa" w:w="3012"/>
+            <w:tcBorders>
+              <w:top w:val="single" w:color="BFBFBF" w:sz="4"/>
+              <w:left w:val="single" w:color="BFBFBF" w:sz="4"/>
+              <w:bottom w:val="single" w:color="BFBFBF" w:sz="4"/>
+              <w:right w:val="single" w:color="BFBFBF" w:sz="4"/>
+            </w:tcBorders>
+            <w:tcMar>
+              <w:top w:type="dxa" w:w="60"/>
+              <w:left w:type="dxa" w:w="100"/>
+              <w:bottom w:type="dxa" w:w="60"/>
+              <w:right w:type="dxa" w:w="100"/>
+            </w:tcMar>
+          </w:tcPr>
+          <w:p>
+            <w:pPr>
+              <w:spacing w:after="0" w:line="252"/>
+            </w:pPr>
+            <w:r>
+              <w:rPr>
+                <w:rFonts w:ascii="Consolas" w:cs="Consolas" w:eastAsia="Consolas" w:hAnsi="Consolas"/>
+                <w:color w:val="1F4D78"/>
+                <w:sz w:val="19"/>
+                <w:szCs w:val="19"/>
+              </w:rPr>
+              <w:t xml:space="preserve">Scripts/Network/LanDiscovery.cs</w:t>
+            </w:r>
+          </w:p>
+        </w:tc>
+        <w:tc>
+          <w:tcPr>
+            <w:tcW w:type="dxa" w:w="7028"/>
+            <w:tcBorders>
+              <w:top w:val="single" w:color="BFBFBF" w:sz="4"/>
+              <w:left w:val="single" w:color="BFBFBF" w:sz="4"/>
+              <w:bottom w:val="single" w:color="BFBFBF" w:sz="4"/>
+              <w:right w:val="single" w:color="BFBFBF" w:sz="4"/>
+            </w:tcBorders>
+            <w:tcMar>
+              <w:top w:type="dxa" w:w="60"/>
+              <w:left w:type="dxa" w:w="100"/>
+              <w:bottom w:type="dxa" w:w="60"/>
+              <w:right w:type="dxa" w:w="100"/>
+            </w:tcMar>
+          </w:tcPr>
+          <w:p>
+            <w:pPr>
+              <w:spacing w:after="0" w:line="252"/>
+            </w:pPr>
+            <w:r>
+              <w:t xml:space="preserve">Las partidas en la misma PC o en la red. La PC con la partida abierta escucha el puerto UDP 7771 y contesta las preguntas que las pantallas de conexión mandan por broadcast: id, versión, puerto, jugadores, si ya están jugando y el nombre del host. No pasa por FishNet.</w:t>
+            </w:r>
+          </w:p>
+        </w:tc>
+      </w:tr>
+      <w:tr>
+        <w:tc>
+          <w:tcPr>
+            <w:tcW w:type="dxa" w:w="3012"/>
+            <w:tcBorders>
+              <w:top w:val="single" w:color="BFBFBF" w:sz="4"/>
+              <w:left w:val="single" w:color="BFBFBF" w:sz="4"/>
+              <w:bottom w:val="single" w:color="BFBFBF" w:sz="4"/>
+              <w:right w:val="single" w:color="BFBFBF" w:sz="4"/>
+            </w:tcBorders>
+            <w:tcMar>
+              <w:top w:type="dxa" w:w="60"/>
+              <w:left w:type="dxa" w:w="100"/>
+              <w:bottom w:type="dxa" w:w="60"/>
+              <w:right w:type="dxa" w:w="100"/>
+            </w:tcMar>
+          </w:tcPr>
+          <w:p>
+            <w:pPr>
+              <w:spacing w:after="0" w:line="252"/>
+            </w:pPr>
+            <w:r>
+              <w:rPr>
+                <w:rFonts w:ascii="Consolas" w:cs="Consolas" w:eastAsia="Consolas" w:hAnsi="Consolas"/>
+                <w:color w:val="1F4D78"/>
+                <w:sz w:val="19"/>
+                <w:szCs w:val="19"/>
+              </w:rPr>
+              <w:t xml:space="preserve">Scripts/Network/NetAddress.cs</w:t>
+            </w:r>
+          </w:p>
+        </w:tc>
+        <w:tc>
+          <w:tcPr>
+            <w:tcW w:type="dxa" w:w="7028"/>
+            <w:tcBorders>
+              <w:top w:val="single" w:color="BFBFBF" w:sz="4"/>
+              <w:left w:val="single" w:color="BFBFBF" w:sz="4"/>
+              <w:bottom w:val="single" w:color="BFBFBF" w:sz="4"/>
+              <w:right w:val="single" w:color="BFBFBF" w:sz="4"/>
+            </w:tcBorders>
+            <w:tcMar>
+              <w:top w:type="dxa" w:w="60"/>
+              <w:left w:type="dxa" w:w="100"/>
+              <w:bottom w:type="dxa" w:w="60"/>
+              <w:right w:type="dxa" w:w="100"/>
+            </w:tcMar>
+          </w:tcPr>
+          <w:p>
+            <w:pPr>
+              <w:spacing w:after="0" w:line="252"/>
+            </w:pPr>
+            <w:r>
+              <w:t xml:space="preserve">Las direcciones: separa host[:puerto], arma el texto para mostrar y averigua la IP de esta PC en la red (la que muestran la sala y la pausa en el host).</w:t>
+            </w:r>
+          </w:p>
+        </w:tc>
+      </w:tr>
+      <w:tr>
+        <w:tc>
+          <w:tcPr>
+            <w:tcW w:type="dxa" w:w="3012"/>
+            <w:tcBorders>
+              <w:top w:val="single" w:color="BFBFBF" w:sz="4"/>
+              <w:left w:val="single" w:color="BFBFBF" w:sz="4"/>
+              <w:bottom w:val="single" w:color="BFBFBF" w:sz="4"/>
+              <w:right w:val="single" w:color="BFBFBF" w:sz="4"/>
+            </w:tcBorders>
+            <w:tcMar>
+              <w:top w:type="dxa" w:w="60"/>
+              <w:left w:type="dxa" w:w="100"/>
+              <w:bottom w:type="dxa" w:w="60"/>
+              <w:right w:type="dxa" w:w="100"/>
+            </w:tcMar>
+          </w:tcPr>
+          <w:p>
+            <w:pPr>
+              <w:spacing w:after="0" w:line="252"/>
+            </w:pPr>
+            <w:r>
+              <w:rPr>
+                <w:rFonts w:ascii="Consolas" w:cs="Consolas" w:eastAsia="Consolas" w:hAnsi="Consolas"/>
+                <w:color w:val="1F4D78"/>
+                <w:sz w:val="19"/>
+                <w:szCs w:val="19"/>
+              </w:rPr>
+              <w:t xml:space="preserve">Scripts/UI/UI_PauseMenu.cs</w:t>
+            </w:r>
+          </w:p>
+        </w:tc>
+        <w:tc>
+          <w:tcPr>
+            <w:tcW w:type="dxa" w:w="7028"/>
+            <w:tcBorders>
+              <w:top w:val="single" w:color="BFBFBF" w:sz="4"/>
+              <w:left w:val="single" w:color="BFBFBF" w:sz="4"/>
+              <w:bottom w:val="single" w:color="BFBFBF" w:sz="4"/>
+              <w:right w:val="single" w:color="BFBFBF" w:sz="4"/>
+            </w:tcBorders>
+            <w:tcMar>
+              <w:top w:type="dxa" w:w="60"/>
+              <w:left w:type="dxa" w:w="100"/>
+              <w:bottom w:type="dxa" w:w="60"/>
+              <w:right w:type="dxa" w:w="100"/>
+            </w:tcMar>
+          </w:tcPr>
+          <w:p>
+            <w:pPr>
+              <w:spacing w:after="0" w:line="252"/>
+            </w:pPr>
+            <w:r>
+              <w:t xml:space="preserve">El menú de pausa (ESC o Start): Ajustes, Desatascarse (manda el pedido al servidor) y Salir, que corta la conexión. Siendo host, Salir cierra la partida para todos y pregunta antes.</w:t>
+            </w:r>
+          </w:p>
+        </w:tc>
+      </w:tr>
+      <w:tr>
+        <w:tc>
+          <w:tcPr>
+            <w:tcW w:type="dxa" w:w="3012"/>
+            <w:tcBorders>
+              <w:top w:val="single" w:color="BFBFBF" w:sz="4"/>
+              <w:left w:val="single" w:color="BFBFBF" w:sz="4"/>
+              <w:bottom w:val="single" w:color="BFBFBF" w:sz="4"/>
+              <w:right w:val="single" w:color="BFBFBF" w:sz="4"/>
+            </w:tcBorders>
+            <w:tcMar>
+              <w:top w:type="dxa" w:w="60"/>
+              <w:left w:type="dxa" w:w="100"/>
+              <w:bottom w:type="dxa" w:w="60"/>
+              <w:right w:type="dxa" w:w="100"/>
+            </w:tcMar>
+          </w:tcPr>
+          <w:p>
+            <w:pPr>
+              <w:spacing w:after="0" w:line="252"/>
+            </w:pPr>
+            <w:r>
+              <w:rPr>
+                <w:rFonts w:ascii="Consolas" w:cs="Consolas" w:eastAsia="Consolas" w:hAnsi="Consolas"/>
+                <w:color w:val="1F4D78"/>
+                <w:sz w:val="19"/>
+                <w:szCs w:val="19"/>
+              </w:rPr>
               <w:t xml:space="preserve">Scripts/Network/ConnectionHUD.cs</w:t>
             </w:r>
           </w:p>
@@ -617,19 +837,7 @@
               <w:spacing w:after="0" w:line="252"/>
             </w:pPr>
             <w:r>
-              <w:t xml:space="preserve">Botones de Iniciar Host / Conectar (IMGUI). Configura el puerto del transporte. El botón de host solo aparece en el editor o en una build con </w:t>
-            </w:r>
-            <w:r>
-              <w:rPr>
-                <w:rFonts w:ascii="Consolas" w:cs="Consolas" w:eastAsia="Consolas" w:hAnsi="Consolas"/>
-                <w:color w:val="1F4D78"/>
-                <w:sz w:val="19"/>
-                <w:szCs w:val="19"/>
-              </w:rPr>
-              <w:t xml:space="preserve">-host</w:t>
-            </w:r>
-            <w:r>
-              <w:t xml:space="preserve">.</w:t>
+              <w:t xml:space="preserve">El recuadro viejo de Iniciar Host / Conectar (IMGUI): solo en la escena Test_Network, que no tiene el prefab de menús.</w:t>
             </w:r>
           </w:p>
         </w:tc>
@@ -3138,16 +3346,19 @@
         <w:spacing w:after="80" w:line="276"/>
       </w:pPr>
       <w:r>
-        <w:rPr>
-          <w:rFonts w:ascii="Consolas" w:cs="Consolas" w:eastAsia="Consolas" w:hAnsi="Consolas"/>
-          <w:color w:val="1F4D78"/>
-          <w:sz w:val="19"/>
-          <w:szCs w:val="19"/>
-        </w:rPr>
-        <w:t xml:space="preserve">ConnectionHUD</w:t>
-      </w:r>
-      <w:r>
-        <w:t xml:space="preserve"> arranca el host (</w:t>
+        <w:t xml:space="preserve">La pantalla de conexión (</w:t>
+      </w:r>
+      <w:r>
+        <w:rPr>
+          <w:rFonts w:ascii="Consolas" w:cs="Consolas" w:eastAsia="Consolas" w:hAnsi="Consolas"/>
+          <w:color w:val="1F4D78"/>
+          <w:sz w:val="19"/>
+          <w:szCs w:val="19"/>
+        </w:rPr>
+        <w:t xml:space="preserve">UI_ConnectPanel</w:t>
+      </w:r>
+      <w:r>
+        <w:t xml:space="preserve">) arranca el host: primero el servidor (</w:t>
       </w:r>
       <w:r>
         <w:rPr>
@@ -3159,19 +3370,43 @@
         <w:t xml:space="preserve">ServerManager.StartConnection</w:t>
       </w:r>
       <w:r>
-        <w:t xml:space="preserve"> + </w:t>
-      </w:r>
-      <w:r>
-        <w:rPr>
-          <w:rFonts w:ascii="Consolas" w:cs="Consolas" w:eastAsia="Consolas" w:hAnsi="Consolas"/>
-          <w:color w:val="1F4D78"/>
-          <w:sz w:val="19"/>
-          <w:szCs w:val="19"/>
-        </w:rPr>
-        <w:t xml:space="preserve">ClientManager.StartConnection("127.0.0.1")</w:t>
-      </w:r>
-      <w:r>
-        <w:t xml:space="preserve">) o un cliente con la dirección elegida.</w:t>
+        <w:t xml:space="preserve">) y, cuando avisa que arrancó (</w:t>
+      </w:r>
+      <w:r>
+        <w:rPr>
+          <w:rFonts w:ascii="Consolas" w:cs="Consolas" w:eastAsia="Consolas" w:hAnsi="Consolas"/>
+          <w:color w:val="1F4D78"/>
+          <w:sz w:val="19"/>
+          <w:szCs w:val="19"/>
+        </w:rPr>
+        <w:t xml:space="preserve">OnServerConnectionState</w:t>
+      </w:r>
+      <w:r>
+        <w:t xml:space="preserve">), el cliente local (</w:t>
+      </w:r>
+      <w:r>
+        <w:rPr>
+          <w:rFonts w:ascii="Consolas" w:cs="Consolas" w:eastAsia="Consolas" w:hAnsi="Consolas"/>
+          <w:color w:val="1F4D78"/>
+          <w:sz w:val="19"/>
+          <w:szCs w:val="19"/>
+        </w:rPr>
+        <w:t xml:space="preserve">ClientManager.StartConnection("127.0.0.1", puerto)</w:t>
+      </w:r>
+      <w:r>
+        <w:t xml:space="preserve">). Si el servidor no arranca (otra ventana de la misma PC ya tiene el puerto), avisa y no conecta: si no, este cliente se metería en la partida de la otra. Un cliente se conecta a la dirección escrita o a una de la lista de partidas (</w:t>
+      </w:r>
+      <w:r>
+        <w:rPr>
+          <w:rFonts w:ascii="Consolas" w:cs="Consolas" w:eastAsia="Consolas" w:hAnsi="Consolas"/>
+          <w:color w:val="1F4D78"/>
+          <w:sz w:val="19"/>
+          <w:szCs w:val="19"/>
+        </w:rPr>
+        <w:t xml:space="preserve">LanDiscovery</w:t>
+      </w:r>
+      <w:r>
+        <w:t xml:space="preserve">).</w:t>
       </w:r>
     </w:p>
     <w:p>
@@ -3184,53 +3419,43 @@
         <w:spacing w:after="80" w:line="276"/>
       </w:pPr>
       <w:r>
-        <w:t xml:space="preserve">Cuando la conexión termina de cargar la escena (</w:t>
-      </w:r>
-      <w:r>
-        <w:rPr>
-          <w:rFonts w:ascii="Consolas" w:cs="Consolas" w:eastAsia="Consolas" w:hAnsi="Consolas"/>
-          <w:color w:val="1F4D78"/>
-          <w:sz w:val="19"/>
-          <w:szCs w:val="19"/>
-        </w:rPr>
-        <w:t xml:space="preserve">SceneManager.OnClientLoadedStartScenes</w:t>
-      </w:r>
-      <w:r>
-        <w:t xml:space="preserve">), </w:t>
-      </w:r>
-      <w:r>
-        <w:rPr>
-          <w:rFonts w:ascii="Consolas" w:cs="Consolas" w:eastAsia="Consolas" w:hAnsi="Consolas"/>
-          <w:color w:val="1F4D78"/>
-          <w:sz w:val="19"/>
-          <w:szCs w:val="19"/>
-        </w:rPr>
-        <w:t xml:space="preserve">NetworkGameManager</w:t>
-      </w:r>
-      <w:r>
-        <w:t xml:space="preserve"> la mete en la escena con </w:t>
-      </w:r>
-      <w:r>
-        <w:rPr>
-          <w:rFonts w:ascii="Consolas" w:cs="Consolas" w:eastAsia="Consolas" w:hAnsi="Consolas"/>
-          <w:color w:val="1F4D78"/>
-          <w:sz w:val="19"/>
-          <w:szCs w:val="19"/>
-        </w:rPr>
-        <w:t xml:space="preserve">AddConnectionToScene</w:t>
-      </w:r>
-      <w:r>
-        <w:t xml:space="preserve">. </w:t>
-      </w:r>
-      <w:r>
-        <w:rPr>
-          <w:b/>
-          <w:bCs/>
-        </w:rPr>
-        <w:t xml:space="preserve">Es imprescindible:</w:t>
-      </w:r>
-      <w:r>
-        <w:t xml:space="preserve"> sin eso el cliente no observa los NetworkObjects de escena (la sala) y sus ServerRpcs mueren con "client is not active". Todavía no se crea ningún personaje.</w:t>
+        <w:t xml:space="preserve">Antes de cada intento se corta cualquier intento anterior, también uno que todavía se está conectando: </w:t>
+      </w:r>
+      <w:r>
+        <w:rPr>
+          <w:rFonts w:ascii="Consolas" w:cs="Consolas" w:eastAsia="Consolas" w:hAnsi="Consolas"/>
+          <w:color w:val="1F4D78"/>
+          <w:sz w:val="19"/>
+          <w:szCs w:val="19"/>
+        </w:rPr>
+        <w:t xml:space="preserve">UI_MainMenu.StopNetworking</w:t>
+      </w:r>
+      <w:r>
+        <w:t xml:space="preserve"> mira el estado del transporte (</w:t>
+      </w:r>
+      <w:r>
+        <w:rPr>
+          <w:rFonts w:ascii="Consolas" w:cs="Consolas" w:eastAsia="Consolas" w:hAnsi="Consolas"/>
+          <w:color w:val="1F4D78"/>
+          <w:sz w:val="19"/>
+          <w:szCs w:val="19"/>
+        </w:rPr>
+        <w:t xml:space="preserve">Transport.GetConnectionState</w:t>
+      </w:r>
+      <w:r>
+        <w:t xml:space="preserve">), porque </w:t>
+      </w:r>
+      <w:r>
+        <w:rPr>
+          <w:rFonts w:ascii="Consolas" w:cs="Consolas" w:eastAsia="Consolas" w:hAnsi="Consolas"/>
+          <w:color w:val="1F4D78"/>
+          <w:sz w:val="19"/>
+          <w:szCs w:val="19"/>
+        </w:rPr>
+        <w:t xml:space="preserve">IsClientStarted</w:t>
+      </w:r>
+      <w:r>
+        <w:t xml:space="preserve"> recién da true al terminar de conectar. Un intento a medias que seguía vivo, al cerrarse, tiraba abajo la partida creada después.</w:t>
       </w:r>
     </w:p>
     <w:p>
@@ -3243,55 +3468,53 @@
         <w:spacing w:after="80" w:line="276"/>
       </w:pPr>
       <w:r>
-        <w:t xml:space="preserve">En la sala (</w:t>
-      </w:r>
-      <w:r>
-        <w:rPr>
-          <w:rFonts w:ascii="Consolas" w:cs="Consolas" w:eastAsia="Consolas" w:hAnsi="Consolas"/>
-          <w:color w:val="1F4D78"/>
-          <w:sz w:val="19"/>
-          <w:szCs w:val="19"/>
-        </w:rPr>
-        <w:t xml:space="preserve">LobbyManager</w:t>
-      </w:r>
-      <w:r>
-        <w:t xml:space="preserve">) cada cliente pide su lugar, equipo y clase por ServerRpcs con </w:t>
-      </w:r>
-      <w:r>
-        <w:rPr>
-          <w:rFonts w:ascii="Consolas" w:cs="Consolas" w:eastAsia="Consolas" w:hAnsi="Consolas"/>
-          <w:color w:val="1F4D78"/>
-          <w:sz w:val="19"/>
-          <w:szCs w:val="19"/>
-        </w:rPr>
-        <w:t xml:space="preserve">RequireOwnership = false</w:t>
-      </w:r>
-      <w:r>
-        <w:t xml:space="preserve"> (el cliente no es dueño del objeto de la sala). FishNet completa el parámetro </w:t>
-      </w:r>
-      <w:r>
-        <w:rPr>
-          <w:rFonts w:ascii="Consolas" w:cs="Consolas" w:eastAsia="Consolas" w:hAnsi="Consolas"/>
-          <w:color w:val="1F4D78"/>
-          <w:sz w:val="19"/>
-          <w:szCs w:val="19"/>
-        </w:rPr>
-        <w:t xml:space="preserve">NetworkConnection sender</w:t>
-      </w:r>
-      <w:r>
-        <w:t xml:space="preserve">, así nadie puede pedir por otro. El servidor valida y, si rechaza, responde </w:t>
-      </w:r>
-      <w:r>
-        <w:rPr>
-          <w:rFonts w:ascii="Consolas" w:cs="Consolas" w:eastAsia="Consolas" w:hAnsi="Consolas"/>
-          <w:color w:val="1F4D78"/>
-          <w:sz w:val="19"/>
-          <w:szCs w:val="19"/>
-        </w:rPr>
-        <w:t xml:space="preserve">TargetReject</w:t>
-      </w:r>
-      <w:r>
-        <w:t xml:space="preserve"> con un enum.</w:t>
+        <w:t xml:space="preserve">Cuando la conexión termina de cargar la escena (</w:t>
+      </w:r>
+      <w:r>
+        <w:rPr>
+          <w:rFonts w:ascii="Consolas" w:cs="Consolas" w:eastAsia="Consolas" w:hAnsi="Consolas"/>
+          <w:color w:val="1F4D78"/>
+          <w:sz w:val="19"/>
+          <w:szCs w:val="19"/>
+        </w:rPr>
+        <w:t xml:space="preserve">SceneManager.OnClientLoadedStartScenes</w:t>
+      </w:r>
+      <w:r>
+        <w:t xml:space="preserve">), </w:t>
+      </w:r>
+      <w:r>
+        <w:rPr>
+          <w:rFonts w:ascii="Consolas" w:cs="Consolas" w:eastAsia="Consolas" w:hAnsi="Consolas"/>
+          <w:color w:val="1F4D78"/>
+          <w:sz w:val="19"/>
+          <w:szCs w:val="19"/>
+        </w:rPr>
+        <w:t xml:space="preserve">NetworkGameManager</w:t>
+      </w:r>
+      <w:r>
+        <w:t xml:space="preserve"> la mete en la escena con </w:t>
+      </w:r>
+      <w:r>
+        <w:rPr>
+          <w:rFonts w:ascii="Consolas" w:cs="Consolas" w:eastAsia="Consolas" w:hAnsi="Consolas"/>
+          <w:color w:val="1F4D78"/>
+          <w:sz w:val="19"/>
+          <w:szCs w:val="19"/>
+        </w:rPr>
+        <w:t xml:space="preserve">AddConnectionToScene</w:t>
+      </w:r>
+      <w:r>
+        <w:t xml:space="preserve">. </w:t>
+      </w:r>
+      <w:r>
+        <w:rPr>
+          <w:b/>
+          <w:bCs/>
+        </w:rPr>
+        <w:t xml:space="preserve">Es imprescindible:</w:t>
+      </w:r>
+      <w:r>
+        <w:t xml:space="preserve"> sin eso el cliente no observa los NetworkObjects de escena (la sala) y sus ServerRpcs mueren con "client is not active". Todavía no se crea ningún personaje.</w:t>
       </w:r>
     </w:p>
     <w:p>
@@ -3304,6 +3527,67 @@
         <w:spacing w:after="80" w:line="276"/>
       </w:pPr>
       <w:r>
+        <w:t xml:space="preserve">En la sala (</w:t>
+      </w:r>
+      <w:r>
+        <w:rPr>
+          <w:rFonts w:ascii="Consolas" w:cs="Consolas" w:eastAsia="Consolas" w:hAnsi="Consolas"/>
+          <w:color w:val="1F4D78"/>
+          <w:sz w:val="19"/>
+          <w:szCs w:val="19"/>
+        </w:rPr>
+        <w:t xml:space="preserve">LobbyManager</w:t>
+      </w:r>
+      <w:r>
+        <w:t xml:space="preserve">) cada cliente pide su lugar, equipo y clase por ServerRpcs con </w:t>
+      </w:r>
+      <w:r>
+        <w:rPr>
+          <w:rFonts w:ascii="Consolas" w:cs="Consolas" w:eastAsia="Consolas" w:hAnsi="Consolas"/>
+          <w:color w:val="1F4D78"/>
+          <w:sz w:val="19"/>
+          <w:szCs w:val="19"/>
+        </w:rPr>
+        <w:t xml:space="preserve">RequireOwnership = false</w:t>
+      </w:r>
+      <w:r>
+        <w:t xml:space="preserve"> (el cliente no es dueño del objeto de la sala). FishNet completa el parámetro </w:t>
+      </w:r>
+      <w:r>
+        <w:rPr>
+          <w:rFonts w:ascii="Consolas" w:cs="Consolas" w:eastAsia="Consolas" w:hAnsi="Consolas"/>
+          <w:color w:val="1F4D78"/>
+          <w:sz w:val="19"/>
+          <w:szCs w:val="19"/>
+        </w:rPr>
+        <w:t xml:space="preserve">NetworkConnection sender</w:t>
+      </w:r>
+      <w:r>
+        <w:t xml:space="preserve">, así nadie puede pedir por otro. El servidor valida y, si rechaza, responde </w:t>
+      </w:r>
+      <w:r>
+        <w:rPr>
+          <w:rFonts w:ascii="Consolas" w:cs="Consolas" w:eastAsia="Consolas" w:hAnsi="Consolas"/>
+          <w:color w:val="1F4D78"/>
+          <w:sz w:val="19"/>
+          <w:szCs w:val="19"/>
+        </w:rPr>
+        <w:t xml:space="preserve">TargetReject</w:t>
+      </w:r>
+      <w:r>
+        <w:t xml:space="preserve"> con un enum.</w:t>
+      </w:r>
+    </w:p>
+    <w:p>
+      <w:pPr>
+        <w:pStyle w:val="ListParagraph"/>
+        <w:numPr>
+          <w:ilvl w:val="0"/>
+          <w:numId w:val="3"/>
+        </w:numPr>
+        <w:spacing w:after="80" w:line="276"/>
+      </w:pPr>
+      <w:r>
         <w:t xml:space="preserve">El host aprieta Start (</w:t>
       </w:r>
       <w:r>
@@ -3744,7 +4028,7 @@
           <w:b/>
           <w:bCs/>
         </w:rPr>
-        <w:t xml:space="preserve">Desatascarse (botón Unstuck del recuadro de red): ServerUnstuck valida condiciones (quieto un rato, sin combate reciente, sin control legítimo encima) y reemplaza el personaje por uno nuevo del prefab (ServerRespawnFresh). El motivo de un rechazo viaja como clave de texto. Desde el 19 de octubre de 2026 el cliente manda con el pedido una foto de su lado (input, menús, cursor, movimiento, tags) y el host guarda las dos partes en Unstuck.log (en el editor, en Logs/; en una build, junto al Player.log), también los pedidos rechazados.</w:t>
+        <w:t xml:space="preserve">Desatascarse (botón del menú de pausa): ServerUnstuck valida condiciones (quieto un rato, sin combate reciente, sin control legítimo encima) y reemplaza el personaje por uno nuevo del prefab (ServerRespawnFresh). El motivo de un rechazo viaja como clave de texto. Desde el 19 de octubre de 2026 el cliente manda con el pedido una foto de su lado (input, menús, cursor, movimiento, tags) y el host guarda las dos partes en Unstuck.log (en el editor, en Logs/; en una build, junto al Player.log), también los pedidos rechazados.</w:t>
       </w:r>
     </w:p>
     <w:p>
@@ -11501,26 +11785,7 @@
         <w:spacing w:after="80" w:line="276"/>
       </w:pPr>
       <w:r>
-        <w:rPr>
-          <w:b/>
-          <w:bCs/>
-        </w:rPr>
-        <w:t xml:space="preserve">Build con `-host`:</w:t>
-      </w:r>
-      <w:r>
-        <w:t xml:space="preserve"> la misma build sirve para hostear sin el editor encima (</w:t>
-      </w:r>
-      <w:r>
-        <w:rPr>
-          <w:rFonts w:ascii="Consolas" w:cs="Consolas" w:eastAsia="Consolas" w:hAnsi="Consolas"/>
-          <w:color w:val="1F4D78"/>
-          <w:sz w:val="19"/>
-          <w:szCs w:val="19"/>
-        </w:rPr>
-        <w:t xml:space="preserve">Mercenaries.exe -host</w:t>
-      </w:r>
-      <w:r>
-        <w:t xml:space="preserve">).</w:t>
+        <w:t xml:space="preserve">Cualquier build crea la partida (Jugar → Crear partida). Otra ventana de la misma PC, u otra PC de la misma red, la encuentra sola en la lista de partidas; también se puede escribir su dirección (127.0.0.1 en la misma PC, la IP de la red que muestran la sala y la pausa en otra).</w:t>
       </w:r>
     </w:p>
     <w:p>
@@ -11533,14 +11798,7 @@
         <w:spacing w:after="80" w:line="276"/>
       </w:pPr>
       <w:r>
-        <w:rPr>
-          <w:b/>
-          <w:bCs/>
-        </w:rPr>
-        <w:t xml:space="preserve">Por internet:</w:t>
-      </w:r>
-      <w:r>
-        <w:t xml:space="preserve"> el host comparte la dirección de su túnel de playit.gg (UDP 7770).</w:t>
+        <w:t xml:space="preserve">Por internet: el host comparte la dirección de su túnel de playit.gg (UDP 7770) y los demás la escriben en la pantalla de conexión. La lista de partidas no cruza internet.</w:t>
       </w:r>
     </w:p>
     <w:p>
@@ -11553,14 +11811,7 @@
         <w:spacing w:after="80" w:line="276"/>
       </w:pPr>
       <w:r>
-        <w:rPr>
-          <w:b/>
-          <w:bCs/>
-        </w:rPr>
-        <w:t xml:space="preserve">Qué mirar en un cambio de red:</w:t>
-      </w:r>
-      <w:r>
-        <w:t xml:space="preserve"> que se vea igual en la ventana del dueño, en la del otro y en el host; con un bot; y con alguien que entra tarde a la partida.</w:t>
+        <w:t xml:space="preserve">Si en la misma red la partida no aparece en la lista: el firewall de Windows del host (tiene que dejar entrar al juego; es el mismo permiso que pide la partida) o un Wi-Fi que aísla los equipos entre sí (en un evento, llevar un router propio). Si no aparece en la lista, tampoco se puede jugar por esa red.</w:t>
       </w:r>
     </w:p>
     <w:p>
@@ -11577,6 +11828,26 @@
           <w:b/>
           <w:bCs/>
         </w:rPr>
+        <w:t xml:space="preserve">Qué mirar en un cambio de red:</w:t>
+      </w:r>
+      <w:r>
+        <w:t xml:space="preserve"> que se vea igual en la ventana del dueño, en la del otro y en el host; con un bot; y con alguien que entra tarde a la partida.</w:t>
+      </w:r>
+    </w:p>
+    <w:p>
+      <w:pPr>
+        <w:pStyle w:val="ListParagraph"/>
+        <w:numPr>
+          <w:ilvl w:val="0"/>
+          <w:numId w:val="2"/>
+        </w:numPr>
+        <w:spacing w:after="80" w:line="276"/>
+      </w:pPr>
+      <w:r>
+        <w:rPr>
+          <w:b/>
+          <w:bCs/>
+        </w:rPr>
         <w:t xml:space="preserve">Logs: [NetworkASC] avisa índices de registro que faltan; [Server] las activaciones rechazadas; [Unstuck] lo que encontró trabado el desatascarse. El desatascarse, además, queda guardado en Unstuck.log del host.</w:t>
       </w:r>
     </w:p>
@@ -11806,7 +12077,7 @@
         <w:t xml:space="preserve">Los registros dependen del orden.</w:t>
       </w:r>
       <w:r>
-        <w:t xml:space="preserve"> Un host y un cliente con builds distintas resuelven índices distintos sin ningún aviso. Convendría mandar una versión o un hash de los registros al conectar y rechazar si no coincide.</w:t>
+        <w:t xml:space="preserve"> Un host y un cliente con builds distintas resuelven índices distintos sin ningún aviso. Convendría mandar una versión o un hash de los registros al conectar y rechazar si no coincide. La lista de partidas ya compara la versión del juego (Application.version): una distinta aparece pero no se puede elegir. Conectar con la dirección escrita no compara nada.</w:t>
       </w:r>
     </w:p>
     <w:p>

</xml_diff>

<commit_message>
Showcase, etapa 3: tres ventanas en una PC, cada una con su control
Cada ventana tiene su puesto (LocalSeat): -pad juega con el control que
aprieta A mientras la ventana tiene el foco (cartel UI_PadClaim), -kbm con
teclado y mouse, -mute sin sonido; en el editor, los tags de MPPM. Las
copias del asset de input (jugador, menús, espectador) escuchan solo los
dispositivos de su ventana; el cursor no lo atrapa una ventana de control
y los botones que se dibujan siguen al puesto.

El espectador se maneja con control (mapa "Spectator" del asset). Cada
build de Windows deja un Showcase.bat que abre las tres ventanas, una por
monitor. Documentos al día.

Co-Authored-By: Claude Opus 5.5 <noreply@anthropic.com>
</commit_message>
<xml_diff>
--- a/DesignDocuments/Red_Arquitectura.docx
+++ b/DesignDocuments/Red_Arquitectura.docx
@@ -45,7 +45,7 @@
           <w:sz w:val="20"/>
           <w:szCs w:val="20"/>
         </w:rPr>
-        <w:t xml:space="preserve">Estado del código al 26 de octubre de 2026 · FishNet 4.7.2 · Unity 6000.0.59f2</w:t>
+        <w:t xml:space="preserve">Estado del código al 28 de octubre de 2026 · FishNet 4.7.2 · Unity 6000.0.59f2</w:t>
       </w:r>
     </w:p>
     <w:p>
@@ -11812,6 +11812,127 @@
       </w:pPr>
       <w:r>
         <w:t xml:space="preserve">Si en la misma red la partida no aparece en la lista: el firewall de Windows del host (tiene que dejar entrar al juego; es el mismo permiso que pide la partida) o un Wi-Fi que aísla los equipos entre sí (en un evento, llevar un router propio). Si no aparece en la lista, tampoco se puede jugar por esa red.</w:t>
+      </w:r>
+    </w:p>
+    <w:p>
+      <w:pPr>
+        <w:pStyle w:val="ListParagraph"/>
+        <w:numPr>
+          <w:ilvl w:val="0"/>
+          <w:numId w:val="2"/>
+        </w:numPr>
+        <w:spacing w:after="80" w:line="276"/>
+      </w:pPr>
+      <w:r>
+        <w:t xml:space="preserve">Varias ventanas en una PC (el showcase): cada build de Windows sale con un </w:t>
+      </w:r>
+      <w:r>
+        <w:rPr>
+          <w:rFonts w:ascii="Consolas" w:cs="Consolas" w:eastAsia="Consolas" w:hAnsi="Consolas"/>
+          <w:color w:val="1F4D78"/>
+          <w:sz w:val="19"/>
+          <w:szCs w:val="19"/>
+        </w:rPr>
+        <w:t xml:space="preserve">Showcase.bat</w:t>
+      </w:r>
+      <w:r>
+        <w:t xml:space="preserve"> al lado del .exe que abre tres ventanas, una por monitor (la 1 con </w:t>
+      </w:r>
+      <w:r>
+        <w:rPr>
+          <w:rFonts w:ascii="Consolas" w:cs="Consolas" w:eastAsia="Consolas" w:hAnsi="Consolas"/>
+          <w:color w:val="1F4D78"/>
+          <w:sz w:val="19"/>
+          <w:szCs w:val="19"/>
+        </w:rPr>
+        <w:t xml:space="preserve">-kbm</w:t>
+      </w:r>
+      <w:r>
+        <w:t xml:space="preserve">, la 2 y la 3 con </w:t>
+      </w:r>
+      <w:r>
+        <w:rPr>
+          <w:rFonts w:ascii="Consolas" w:cs="Consolas" w:eastAsia="Consolas" w:hAnsi="Consolas"/>
+          <w:color w:val="1F4D78"/>
+          <w:sz w:val="19"/>
+          <w:szCs w:val="19"/>
+        </w:rPr>
+        <w:t xml:space="preserve">-pad -mute</w:t>
+      </w:r>
+      <w:r>
+        <w:t xml:space="preserve">). Cada ventana juega solo con sus dispositivos (</w:t>
+      </w:r>
+      <w:r>
+        <w:rPr>
+          <w:rFonts w:ascii="Consolas" w:cs="Consolas" w:eastAsia="Consolas" w:hAnsi="Consolas"/>
+          <w:color w:val="1F4D78"/>
+          <w:sz w:val="19"/>
+          <w:szCs w:val="19"/>
+        </w:rPr>
+        <w:t xml:space="preserve">LocalSeat</w:t>
+      </w:r>
+      <w:r>
+        <w:t xml:space="preserve">): una </w:t>
+      </w:r>
+      <w:r>
+        <w:rPr>
+          <w:rFonts w:ascii="Consolas" w:cs="Consolas" w:eastAsia="Consolas" w:hAnsi="Consolas"/>
+          <w:color w:val="1F4D78"/>
+          <w:sz w:val="19"/>
+          <w:szCs w:val="19"/>
+        </w:rPr>
+        <w:t xml:space="preserve">-pad</w:t>
+      </w:r>
+      <w:r>
+        <w:t xml:space="preserve"> se queda con el control que aprieta A mientras ella tiene el foco. No toca la red: son tres clientes normales; una crea la partida y las otras la eligen de la lista. En el editor se hace lo mismo con los tags de MPPM (</w:t>
+      </w:r>
+      <w:r>
+        <w:rPr>
+          <w:rFonts w:ascii="Consolas" w:cs="Consolas" w:eastAsia="Consolas" w:hAnsi="Consolas"/>
+          <w:color w:val="1F4D78"/>
+          <w:sz w:val="19"/>
+          <w:szCs w:val="19"/>
+        </w:rPr>
+        <w:t xml:space="preserve">kbm</w:t>
+      </w:r>
+      <w:r>
+        <w:t xml:space="preserve">, </w:t>
+      </w:r>
+      <w:r>
+        <w:rPr>
+          <w:rFonts w:ascii="Consolas" w:cs="Consolas" w:eastAsia="Consolas" w:hAnsi="Consolas"/>
+          <w:color w:val="1F4D78"/>
+          <w:sz w:val="19"/>
+          <w:szCs w:val="19"/>
+        </w:rPr>
+        <w:t xml:space="preserve">pad</w:t>
+      </w:r>
+      <w:r>
+        <w:t xml:space="preserve">, </w:t>
+      </w:r>
+      <w:r>
+        <w:rPr>
+          <w:rFonts w:ascii="Consolas" w:cs="Consolas" w:eastAsia="Consolas" w:hAnsi="Consolas"/>
+          <w:color w:val="1F4D78"/>
+          <w:sz w:val="19"/>
+          <w:szCs w:val="19"/>
+        </w:rPr>
+        <w:t xml:space="preserve">pad0</w:t>
+      </w:r>
+      <w:r>
+        <w:t xml:space="preserve">…). Cada ventana deja su log (</w:t>
+      </w:r>
+      <w:r>
+        <w:rPr>
+          <w:rFonts w:ascii="Consolas" w:cs="Consolas" w:eastAsia="Consolas" w:hAnsi="Consolas"/>
+          <w:color w:val="1F4D78"/>
+          <w:sz w:val="19"/>
+          <w:szCs w:val="19"/>
+        </w:rPr>
+        <w:t xml:space="preserve">Showcase_1.log</w:t>
+      </w:r>
+      <w:r>
+        <w:t xml:space="preserve">, …).</w:t>
       </w:r>
     </w:p>
     <w:p>

</xml_diff>

<commit_message>
Bots: las habilidades de las clases nuevas que no usaban bien
Revisadas las 32 clases contra BotController. Arreglado: la Resurrección
(el bot va hasta el cuerpo del aliado y lo revive), la Presa del Cazador (de
lejos, sobre el jugador que pelea), las trampas del Trampero (entre él y el
que se acerca, y una detrás al retirarse), la Ejecución del Guardián (contra
uno con poca vida), Aturdir y Enemigo jurado (sobre el que le pega a un
aliado) y la Furia elemental del Chamán (metido en la pelea).

Documentos al día: el LEEME del modo y Red_Arquitectura (sección Bots), y
las pruebas en PENDIENTES.

Co-Authored-By: Claude Opus 5.5 <noreply@anthropic.com>
</commit_message>
<xml_diff>
--- a/DesignDocuments/Red_Arquitectura.docx
+++ b/DesignDocuments/Red_Arquitectura.docx
@@ -11186,6 +11186,43 @@
       </w:r>
       <w:r>
         <w:t xml:space="preserve">: en apuros, lo que vuelve salvavidas a otra habilidad; sin maná, lo normal; si no, otra cada tanto), y un switch de variantes que cobran lo suyo (la Q del Mago) se juzga por la que saldría ahora.</w:t>
+      </w:r>
+    </w:p>
+    <w:p>
+      <w:pPr>
+        <w:pStyle w:val="ListParagraph"/>
+        <w:numPr>
+          <w:ilvl w:val="0"/>
+          <w:numId w:val="2"/>
+        </w:numPr>
+        <w:spacing w:after="80" w:line="276"/>
+      </w:pPr>
+      <w:r>
+        <w:t xml:space="preserve">Qué habilidad usa y cuándo: cada una se juzga por su TIPO (</w:t>
+      </w:r>
+      <w:r>
+        <w:rPr>
+          <w:rFonts w:ascii="Consolas" w:cs="Consolas" w:eastAsia="Consolas" w:hAnsi="Consolas"/>
+          <w:color w:val="1F4D78"/>
+          <w:sz w:val="19"/>
+          <w:szCs w:val="19"/>
+        </w:rPr>
+        <w:t xml:space="preserve">Classify</w:t>
+      </w:r>
+      <w:r>
+        <w:t xml:space="preserve">: cuerpo a cuerpo, a distancia, área, buff, movimiento) y el rol; las que tienen una jugada propia llevan su caso en </w:t>
+      </w:r>
+      <w:r>
+        <w:rPr>
+          <w:rFonts w:ascii="Consolas" w:cs="Consolas" w:eastAsia="Consolas" w:hAnsi="Consolas"/>
+          <w:color w:val="1F4D78"/>
+          <w:sz w:val="19"/>
+          <w:szCs w:val="19"/>
+        </w:rPr>
+        <w:t xml:space="preserve">ShouldUse</w:t>
+      </w:r>
+      <w:r>
+        <w:t xml:space="preserve"> (la Resurrección: el bot camina hasta el cuerpo y apunta a él; las marcas que protegen al equipo van al enemigo que le pega a un aliado; las trampas, entre el Trampero y el que se le acerca). Revisadas las 32 clases el 28 de octubre de 2026. Una habilidad nueva con una jugada particular necesita su caso: si no, cae en "cuerpo a cuerpo".</w:t>
       </w:r>
     </w:p>
     <w:p>

</xml_diff>

<commit_message>
Documentos: el vuelo de los bots y el aterrizaje
- Red_Arquitectura.docx: ServerRequestLand (aterrizar), el vuelo y la picada
  de los bots (BotController.ServerStartFlight / ServerDive), y un párrafo del
  vuelo del Mago bot en la sección de bots.
- CLAUDE.md: las rutas de movimiento de un bot sin dueño.
- LEEME: el Shinobi a distancia y el Mago bot que vuela.

Co-Authored-By: Claude Opus 5.5 <noreply@anthropic.com>
</commit_message>
<xml_diff>
--- a/DesignDocuments/Red_Arquitectura.docx
+++ b/DesignDocuments/Red_Arquitectura.docx
@@ -8564,6 +8564,18 @@
               </w:rPr>
               <w:t xml:space="preserve">TargetStartFlight</w:t>
             </w:r>
+            <w:r>
+              <w:t xml:space="preserve">; aterrizar: </w:t>
+            </w:r>
+            <w:r>
+              <w:rPr>
+                <w:rFonts w:ascii="Consolas" w:cs="Consolas" w:eastAsia="Consolas" w:hAnsi="Consolas"/>
+                <w:color w:val="1F4D78"/>
+                <w:sz w:val="19"/>
+                <w:szCs w:val="19"/>
+              </w:rPr>
+              <w:t xml:space="preserve">ServerRequestLand</w:t>
+            </w:r>
           </w:p>
         </w:tc>
         <w:tc>
@@ -8599,7 +8611,31 @@
               <w:t xml:space="preserve">Status_Flying</w:t>
             </w:r>
             <w:r>
-              <w:t xml:space="preserve">.</w:t>
+              <w:t xml:space="preserve">. El dueño aterriza a propósito con el Shift volando (solo el vuelo del Shift: </w:t>
+            </w:r>
+            <w:r>
+              <w:rPr>
+                <w:rFonts w:ascii="Consolas" w:cs="Consolas" w:eastAsia="Consolas" w:hAnsi="Consolas"/>
+                <w:color w:val="1F4D78"/>
+                <w:sz w:val="19"/>
+                <w:szCs w:val="19"/>
+              </w:rPr>
+              <w:t xml:space="preserve">GA_Flight.EndFlight</w:t>
+            </w:r>
+            <w:r>
+              <w:t xml:space="preserve">) o al pedir el menú de clases en el aire (todo vuelo, también la Sobrecarga; el menú se abre al tocar el piso). Bot: </w:t>
+            </w:r>
+            <w:r>
+              <w:rPr>
+                <w:rFonts w:ascii="Consolas" w:cs="Consolas" w:eastAsia="Consolas" w:hAnsi="Consolas"/>
+                <w:color w:val="1F4D78"/>
+                <w:sz w:val="19"/>
+                <w:szCs w:val="19"/>
+              </w:rPr>
+              <w:t xml:space="preserve">BotController.ServerStartFlight</w:t>
+            </w:r>
+            <w:r>
+              <w:t xml:space="preserve">, su cerebro vuela.</w:t>
             </w:r>
           </w:p>
         </w:tc>
@@ -8682,13 +8718,19 @@
               <w:spacing w:after="0" w:line="252"/>
             </w:pPr>
             <w:r>
-              <w:rPr>
-                <w:rFonts w:ascii="Consolas" w:cs="Consolas" w:eastAsia="Consolas" w:hAnsi="Consolas"/>
-                <w:color w:val="1F4D78"/>
-                <w:sz w:val="19"/>
-                <w:szCs w:val="19"/>
-              </w:rPr>
-              <w:t xml:space="preserve">El dueño cae a DiveSpeed hasta el piso; el servidor espera verlo en el piso (o un tope) para soltar la grieta.</w:t>
+              <w:t xml:space="preserve">El dueño cae a DiveSpeed hasta el piso; el servidor espera verlo en el piso (o un tope) para soltar la grieta. Bot: </w:t>
+            </w:r>
+            <w:r>
+              <w:rPr>
+                <w:rFonts w:ascii="Consolas" w:cs="Consolas" w:eastAsia="Consolas" w:hAnsi="Consolas"/>
+                <w:color w:val="1F4D78"/>
+                <w:sz w:val="19"/>
+                <w:szCs w:val="19"/>
+              </w:rPr>
+              <w:t xml:space="preserve">BotController.ServerDive</w:t>
+            </w:r>
+            <w:r>
+              <w:t xml:space="preserve">.</w:t>
             </w:r>
           </w:p>
         </w:tc>
@@ -8716,7 +8758,19 @@
         <w:t xml:space="preserve">MovesThroughOwner</w:t>
       </w:r>
       <w:r>
-        <w:t xml:space="preserve">, y los bots no la usan. Todo TargetRpc al dueño se protege con </w:t>
+        <w:t xml:space="preserve">, y los bots no la usan, salvo el vuelo (</w:t>
+      </w:r>
+      <w:r>
+        <w:rPr>
+          <w:rFonts w:ascii="Consolas" w:cs="Consolas" w:eastAsia="Consolas" w:hAnsi="Consolas"/>
+          <w:color w:val="1F4D78"/>
+          <w:sz w:val="19"/>
+          <w:szCs w:val="19"/>
+        </w:rPr>
+        <w:t xml:space="preserve">GA_Flight</w:t>
+      </w:r>
+      <w:r>
+        <w:t xml:space="preserve">), que mueve su cerebro. Todo TargetRpc al dueño se protege con </w:t>
       </w:r>
       <w:r>
         <w:rPr>
@@ -11138,7 +11192,7 @@
         <w:spacing w:after="80" w:line="276"/>
       </w:pPr>
       <w:r>
-        <w:t xml:space="preserve">Todo lo que el flujo normal delega en el dueño tiene una ruta del servidor: teletransporte, dash, salto, empuje, respawn. Lo que no la tiene se marca </w:t>
+        <w:t xml:space="preserve">Todo lo que el flujo normal delega en el dueño tiene una ruta del servidor: teletransporte, dash, salto, empuje, respawn, vuelo y picada. Lo que no la tiene se marca </w:t>
       </w:r>
       <w:r>
         <w:rPr>
@@ -11223,6 +11277,43 @@
       </w:r>
       <w:r>
         <w:t xml:space="preserve"> (la Resurrección: el bot camina hasta el cuerpo y apunta a él; las marcas que protegen al equipo van al enemigo que le pega a un aliado; las trampas, entre el Trampero y el que se le acerca). Revisadas las 32 clases el 28 de octubre de 2026. Una habilidad nueva con una jugada particular necesita su caso: si no, cae en "cuerpo a cuerpo".</w:t>
+      </w:r>
+    </w:p>
+    <w:p>
+      <w:pPr>
+        <w:pStyle w:val="ListParagraph"/>
+        <w:numPr>
+          <w:ilvl w:val="0"/>
+          <w:numId w:val="2"/>
+        </w:numPr>
+        <w:spacing w:after="80" w:line="276"/>
+      </w:pPr>
+      <w:r>
+        <w:t xml:space="preserve">El vuelo (el Mago, desde el 29 de octubre de 2026): </w:t>
+      </w:r>
+      <w:r>
+        <w:rPr>
+          <w:rFonts w:ascii="Consolas" w:cs="Consolas" w:eastAsia="Consolas" w:hAnsi="Consolas"/>
+          <w:color w:val="1F4D78"/>
+          <w:sz w:val="19"/>
+          <w:szCs w:val="19"/>
+        </w:rPr>
+        <w:t xml:space="preserve">BotController</w:t>
+      </w:r>
+      <w:r>
+        <w:t xml:space="preserve"> lo mueve sin NavMeshAgent (apagado, como en el salto) a 8 m sobre el punto al que va, con los números del </w:t>
+      </w:r>
+      <w:r>
+        <w:rPr>
+          <w:rFonts w:ascii="Consolas" w:cs="Consolas" w:eastAsia="Consolas" w:hAnsi="Consolas"/>
+          <w:color w:val="1F4D78"/>
+          <w:sz w:val="19"/>
+          <w:szCs w:val="19"/>
+        </w:rPr>
+        <w:t xml:space="preserve">GA_Flight</w:t>
+      </w:r>
+      <w:r>
+        <w:t xml:space="preserve">, y tira hechizos desde el aire. Despega para escapar, para pelear desde arriba (enemigo a tiro y a la vista) y para cruzar el mapa (destino a más de 20 m); cerca de un lugar techado aterriza afuera y camina. Al terminar el vuelo cae lento y vuelve al NavMesh. En el aire escribe IsJumping y VerticalSpeed, como un jugador que vuela.</w:t>
       </w:r>
     </w:p>
     <w:p>

</xml_diff>

<commit_message>
Probados: la prueba con amigos, el aterrizaje del Mago y las seis reglas de bots; documentos al día
- PENDIENTES: marcados la prueba por internet del 29 de octubre (túnel, reaparecer,
  escudo de la Conquista, animales, bolsa, proyectiles), aterrizar a propósito (Shift,
  C y V en el aire) y las seis habilidades de bots de las clases nuevas.
- LEEME: la bolsa del Objetivo frena un 40 %.
- CLAUDE.md: el proyectil ignora el NetworkObject del que lo tiró y su aviso de
  diagnóstico; un tag con dos fuentes en el cliente (State_Dead) cuenta doble.
- Red_Arquitectura: el arreglo de State_Dead en OnNetTagsChanged.

Co-Authored-By: Claude Opus 5.5 <noreply@anthropic.com>
</commit_message>
<xml_diff>
--- a/DesignDocuments/Red_Arquitectura.docx
+++ b/DesignDocuments/Red_Arquitectura.docx
@@ -6000,6 +6000,76 @@
       </w:r>
       <w:r>
         <w:t xml:space="preserve"> de un SyncHashSet llega de forma asíncrona: un tag de vida corta podía volver a agregarse después de que el servidor lo quitó y quedar pegado para siempre. Con los stats pasaba lo mismo: el eco resucitaba atributos que el servidor acababa de borrar (el robo de vida del Bárbaro seguía en el Pícaro).</w:t>
+      </w:r>
+    </w:p>
+    <w:p>
+      <w:pPr>
+        <w:pStyle w:val="ListParagraph"/>
+        <w:numPr>
+          <w:ilvl w:val="0"/>
+          <w:numId w:val="2"/>
+        </w:numPr>
+        <w:spacing w:after="80" w:line="276"/>
+      </w:pPr>
+      <w:r>
+        <w:rPr>
+          <w:rFonts w:ascii="Consolas" w:cs="Consolas" w:eastAsia="Consolas" w:hAnsi="Consolas"/>
+          <w:color w:val="1F4D78"/>
+          <w:sz w:val="19"/>
+          <w:szCs w:val="19"/>
+        </w:rPr>
+        <w:t xml:space="preserve">State_Dead</w:t>
+      </w:r>
+      <w:r>
+        <w:t xml:space="preserve"> tiene dos fuentes en un cliente: este espejo y la muerte local (la vida en 0 llega por su SyncVar y </w:t>
+      </w:r>
+      <w:r>
+        <w:rPr>
+          <w:rFonts w:ascii="Consolas" w:cs="Consolas" w:eastAsia="Consolas" w:hAnsi="Consolas"/>
+          <w:color w:val="1F4D78"/>
+          <w:sz w:val="19"/>
+          <w:szCs w:val="19"/>
+        </w:rPr>
+        <w:t xml:space="preserve">SetCurrentAttributeValue</w:t>
+      </w:r>
+      <w:r>
+        <w:t xml:space="preserve"> llama a </w:t>
+      </w:r>
+      <w:r>
+        <w:rPr>
+          <w:rFonts w:ascii="Consolas" w:cs="Consolas" w:eastAsia="Consolas" w:hAnsi="Consolas"/>
+          <w:color w:val="1F4D78"/>
+          <w:sz w:val="19"/>
+          <w:szCs w:val="19"/>
+        </w:rPr>
+        <w:t xml:space="preserve">Die</w:t>
+      </w:r>
+      <w:r>
+        <w:t xml:space="preserve">). Si la vida llegaba antes que el tag, el conteo quedaba en 2 y al revivir bajaba a 1: el cliente reaparecía en la base sin poder moverse, aunque el servidor ya lo había revivido. Desde el 29 de octubre de 2026, cuando el servidor quita </w:t>
+      </w:r>
+      <w:r>
+        <w:rPr>
+          <w:rFonts w:ascii="Consolas" w:cs="Consolas" w:eastAsia="Consolas" w:hAnsi="Consolas"/>
+          <w:color w:val="1F4D78"/>
+          <w:sz w:val="19"/>
+          <w:szCs w:val="19"/>
+        </w:rPr>
+        <w:t xml:space="preserve">State_Dead</w:t>
+      </w:r>
+      <w:r>
+        <w:t xml:space="preserve">, </w:t>
+      </w:r>
+      <w:r>
+        <w:rPr>
+          <w:rFonts w:ascii="Consolas" w:cs="Consolas" w:eastAsia="Consolas" w:hAnsi="Consolas"/>
+          <w:color w:val="1F4D78"/>
+          <w:sz w:val="19"/>
+          <w:szCs w:val="19"/>
+        </w:rPr>
+        <w:t xml:space="preserve">OnNetTagsChanged</w:t>
+      </w:r>
+      <w:r>
+        <w:t xml:space="preserve"> le saca todas las cuentas. Cualquier otro tag que el cliente también ponga solo necesita lo mismo.</w:t>
       </w:r>
     </w:p>
     <w:p>

</xml_diff>